<commit_message>
Vérification finale : contrôles à jour, fichiers de relecture régénérés
- check:ar : codes pays et références du JSON-LD ignorés ; nom des offres en
  arabe (« مل », virgule arabe).
- Bannière de consentement : affichée après le premier rendu (règle de lint).
- src/data/ar-relecture.md et docs/relecture-pharmacien.docx régénérés.

Co-Authored-By: Claude Opus 5.5 <noreply@anthropic.com>
</commit_message>
<xml_diff>
--- a/docs/relecture-pharmacien.docx
+++ b/docs/relecture-pharmacien.docx
@@ -582,7 +582,7 @@
           <w:szCs w:val="22"/>
           <w:rtl w:val="false"/>
         </w:rPr>
-        <w:t xml:space="preserve">Mis à jour le 10 octobre 2026 , par l'équipe OTAGE.</w:t>
+        <w:t xml:space="preserve">Mis à jour le 11 octobre 2026 , par l'équipe OTAGE.</w:t>
       </w:r>
     </w:p>
     <w:tbl>
@@ -3130,7 +3130,7 @@
           <w:szCs w:val="22"/>
           <w:rtl w:val="false"/>
         </w:rPr>
-        <w:t xml:space="preserve">Mis à jour le 10 octobre 2026 , par l'équipe OTAGE.</w:t>
+        <w:t xml:space="preserve">Mis à jour le 11 octobre 2026 , par l'équipe OTAGE.</w:t>
       </w:r>
     </w:p>
     <w:tbl>
@@ -4886,7 +4886,7 @@
           <w:szCs w:val="22"/>
           <w:rtl w:val="false"/>
         </w:rPr>
-        <w:t xml:space="preserve">Mis à jour le 10 octobre 2026 , par l'équipe OTAGE.</w:t>
+        <w:t xml:space="preserve">Mis à jour le 11 octobre 2026 , par l'équipe OTAGE.</w:t>
       </w:r>
     </w:p>
     <w:tbl>
@@ -7368,7 +7368,7 @@
           <w:szCs w:val="22"/>
           <w:rtl w:val="false"/>
         </w:rPr>
-        <w:t xml:space="preserve">Mis à jour le 10 octobre 2026 , par l'équipe OTAGE.</w:t>
+        <w:t xml:space="preserve">Mis à jour le 11 octobre 2026 , par l'équipe OTAGE.</w:t>
       </w:r>
     </w:p>
     <w:tbl>
@@ -13235,7 +13235,7 @@
           <w:szCs w:val="22"/>
           <w:rtl/>
         </w:rPr>
-        <w:t xml:space="preserve">آخر تحديث 10 أكتوبر 2026 ، من فريق OTAGE.</w:t>
+        <w:t xml:space="preserve">آخر تحديث 11 أكتوبر 2026 ، من فريق OTAGE.</w:t>
       </w:r>
     </w:p>
     <w:tbl>
@@ -15783,7 +15783,7 @@
           <w:szCs w:val="22"/>
           <w:rtl/>
         </w:rPr>
-        <w:t xml:space="preserve">آخر تحديث 10 أكتوبر 2026 ، من فريق OTAGE.</w:t>
+        <w:t xml:space="preserve">آخر تحديث 11 أكتوبر 2026 ، من فريق OTAGE.</w:t>
       </w:r>
     </w:p>
     <w:tbl>
@@ -17539,7 +17539,7 @@
           <w:szCs w:val="22"/>
           <w:rtl/>
         </w:rPr>
-        <w:t xml:space="preserve">آخر تحديث 10 أكتوبر 2026 ، من فريق OTAGE.</w:t>
+        <w:t xml:space="preserve">آخر تحديث 11 أكتوبر 2026 ، من فريق OTAGE.</w:t>
       </w:r>
     </w:p>
     <w:tbl>
@@ -20021,7 +20021,7 @@
           <w:szCs w:val="22"/>
           <w:rtl/>
         </w:rPr>
-        <w:t xml:space="preserve">آخر تحديث 10 أكتوبر 2026 ، من فريق OTAGE.</w:t>
+        <w:t xml:space="preserve">آخر تحديث 11 أكتوبر 2026 ، من فريق OTAGE.</w:t>
       </w:r>
     </w:p>
     <w:tbl>

</xml_diff>